<commit_message>
Refresh offline terminal kit and quick start
</commit_message>
<xml_diff>
--- a/offline-kits/linux/assignments/Bashcrawl-Terminal-Adventure.docx
+++ b/offline-kits/linux/assignments/Bashcrawl-Terminal-Adventure.docx
@@ -65,7 +65,7 @@
           <w:szCs w:val="48"/>
           <w:rtl w:val="0"/>
         </w:rPr>
-        <w:t xml:space="preserve">Bashcrawl: How Far Can You Go?</w:t>
+        <w:t xml:space="preserve">3.2 Bashcrawl: How Far Can You Go?</w:t>
       </w:r>
     </w:p>
     <w:p>
@@ -437,7 +437,7 @@
           <w:szCs w:val="21"/>
           <w:rtl w:val="0"/>
         </w:rPr>
-        <w:t xml:space="preserve">Impress Me: 20 marks</w:t>
+        <w:t xml:space="preserve">Level 4+ / Impress Me: 20 marks</w:t>
       </w:r>
     </w:p>
     <w:p>
@@ -537,7 +537,7 @@
           <w:szCs w:val="26"/>
           <w:rtl w:val="0"/>
         </w:rPr>
-        <w:t xml:space="preserve">IMPRESS ME: MAKE THE INSTRUCTIONS BETTER</w:t>
+        <w:t xml:space="preserve">LEVEL 4+: MAKE THE INSTRUCTIONS BETTER</w:t>
       </w:r>
     </w:p>
     <w:p>
@@ -556,7 +556,7 @@
         <w:rPr>
           <w:rtl w:val="0"/>
         </w:rPr>
-        <w:t xml:space="preserve"> here is unclear, incomplete, or could be explained better, improve it in your own copy. Use Suggesting mode if it is available. Otherwise, add a clearly labelled “Suggested improvement” with your revised wording. Include one sentence explaining why your version is clearer or more useful. Do not remove required work. Mr. A will review your change and may update the course website and future assignment documents if he agrees it helps. Improving a real instruction accurately is one way to demonstrate Impress Me evidence.</w:t>
+        <w:t xml:space="preserve"> here is unclear, incomplete, or could be explained better, improve it in your own copy. Use Suggesting mode if it is available. Otherwise, add a clearly labelled “Suggested improvement” with your revised wording. Include one sentence explaining why your version is clearer or more useful. Do not remove required work. Mr. A will review your change and may update the course website and future assignment documents if he agrees it helps. Improving a real instruction accurately is Level 4+ evidence. Identify one real weakness, provide clearer replacement wording, and explain why your version is better.</w:t>
       </w:r>
     </w:p>
     <w:p>
@@ -619,7 +619,7 @@
           <w:szCs w:val="21"/>
           <w:rtl w:val="0"/>
         </w:rPr>
-        <w:t xml:space="preserve">Name: [Type here]       Student #: [Type here]       Computer: [WSL / Linux Mint / Ubuntu / Mac / Android / iPhone or iPad]       Date: [Type here]</w:t>
+        <w:t xml:space="preserve">Name: [Type here]       Student #: [Type here]       Computer: [Windows WSL / Windows Git Bash / Mac / Chromebook / Linux / Android / iPhone or iPad]       Date: [Type here]</w:t>
       </w:r>
       <w:r>
         <w:rPr>
@@ -682,7 +682,126 @@
           <w:szCs w:val="21"/>
           <w:rtl w:val="0"/>
         </w:rPr>
-        <w:t xml:space="preserve">There is NO time limit and NO required final room. Keep playing for as long as you can. Try to make progress, explore new paths, and learn from clues. You can continue in another class or at home.</w:t>
+        <w:t xml:space="preserve">There is NO time limit and NO required final room. Keep playing for as long as you can. Try to make progress, explore new paths, and learn from clues.</w:t>
+      </w:r>
+    </w:p>
+    <w:p>
+      <w:pPr>
+        <w:spacing w:after="120" w:before="0" w:lineRule="auto"/>
+        <w:rPr>
+          <w:b w:val="1"/>
+          <w:bCs w:val="1"/>
+          <w:color w:val="1e2b55"/>
+          <w:sz w:val="21"/>
+          <w:szCs w:val="21"/>
+        </w:rPr>
+      </w:pPr>
+      <w:r>
+        <w:rPr>
+          <w:b w:val="1"/>
+          <w:bCs w:val="1"/>
+          <w:color w:val="1e2b55"/>
+          <w:sz w:val="21"/>
+          <w:szCs w:val="21"/>
+          <w:rtl w:val="0"/>
+        </w:rPr>
+        <w:t xml:space="preserve">AT HOME: Bashcrawl works on Windows WSL, Windows Git Bash, Mac, Chromebook, or Linux. A phone is slower and less comfortable, but Android and iPhone or iPad also work.</w:t>
+      </w:r>
+    </w:p>
+    <w:p>
+      <w:pPr>
+        <w:spacing w:after="120" w:before="0" w:lineRule="auto"/>
+        <w:rPr>
+          <w:b w:val="1"/>
+          <w:bCs w:val="1"/>
+          <w:color w:val="1e2b55"/>
+          <w:sz w:val="21"/>
+          <w:szCs w:val="21"/>
+        </w:rPr>
+      </w:pPr>
+      <w:r>
+        <w:rPr>
+          <w:b w:val="1"/>
+          <w:bCs w:val="1"/>
+          <w:color w:val="1e2b55"/>
+          <w:sz w:val="21"/>
+          <w:szCs w:val="21"/>
+          <w:rtl w:val="0"/>
+        </w:rPr>
+        <w:t xml:space="preserve">IN CLASS WITHOUT INTERNET: After Linux Mint is installed, or while Linux Mint is running from the bootable USB, use the Bashcrawl folder in the </w:t>
+      </w:r>
+      <w:hyperlink r:id="rId8">
+        <w:r>
+          <w:rPr>
+            <w:b w:val="1"/>
+            <w:bCs w:val="1"/>
+            <w:color w:val="1155cc"/>
+            <w:sz w:val="21"/>
+            <w:szCs w:val="21"/>
+            <w:u w:val="single"/>
+            <w:rtl w:val="0"/>
+          </w:rPr>
+          <w:t xml:space="preserve">TEJ Linux Offline Kit</w:t>
+        </w:r>
+      </w:hyperlink>
+      <w:r>
+        <w:rPr>
+          <w:b w:val="1"/>
+          <w:bCs w:val="1"/>
+          <w:color w:val="1e2b55"/>
+          <w:sz w:val="21"/>
+          <w:szCs w:val="21"/>
+          <w:rtl w:val="0"/>
+        </w:rPr>
+        <w:t xml:space="preserve">. No Internet or Git download is needed after the game folder is copied.</w:t>
+      </w:r>
+    </w:p>
+    <w:p>
+      <w:pPr>
+        <w:spacing w:after="120" w:before="0" w:lineRule="auto"/>
+        <w:rPr>
+          <w:b w:val="1"/>
+          <w:bCs w:val="1"/>
+          <w:color w:val="1e2b55"/>
+          <w:sz w:val="21"/>
+          <w:szCs w:val="21"/>
+        </w:rPr>
+      </w:pPr>
+      <w:hyperlink r:id="rId9">
+        <w:r>
+          <w:rPr>
+            <w:b w:val="1"/>
+            <w:bCs w:val="1"/>
+            <w:color w:val="1155cc"/>
+            <w:sz w:val="21"/>
+            <w:szCs w:val="21"/>
+            <w:u w:val="single"/>
+            <w:rtl w:val="0"/>
+          </w:rPr>
+          <w:t xml:space="preserve">USB or download instructions and printable quick start</w:t>
+        </w:r>
+      </w:hyperlink>
+      <w:r>
+        <w:rPr>
+          <w:rtl w:val="0"/>
+        </w:rPr>
+      </w:r>
+    </w:p>
+    <w:p>
+      <w:pPr>
+        <w:spacing w:after="120" w:before="0" w:lineRule="auto"/>
+        <w:rPr>
+          <w:b w:val="1"/>
+          <w:bCs w:val="1"/>
+          <w:color w:val="1e2b55"/>
+          <w:sz w:val="21"/>
+          <w:szCs w:val="21"/>
+        </w:rPr>
+      </w:pPr>
+      <w:r>
+        <w:rPr>
+          <w:rtl w:val="0"/>
+        </w:rPr>
       </w:r>
     </w:p>
     <w:p>
@@ -740,7 +859,7 @@
           <w:szCs w:val="21"/>
           <w:rtl w:val="0"/>
         </w:rPr>
-        <w:t xml:space="preserve">Windows: Open Ubuntu from the Start menu (WSL). If WSL is not installed yet, use the Microsoft setup guide linked at the bottom or complete the Terminal Quest setup first.</w:t>
+        <w:t xml:space="preserve">Windows WSL: Open Ubuntu or your installed Linux distribution from Start. If WSL is not installed, use the Microsoft setup guide linked at the bottom or complete Terminal Quest first.</w:t>
       </w:r>
     </w:p>
     <w:p>
@@ -759,6 +878,51 @@
           <w:szCs w:val="21"/>
           <w:rtl w:val="0"/>
         </w:rPr>
+        <w:t xml:space="preserve">Windows Git Bash: With the computer owner's permission, install </w:t>
+      </w:r>
+      <w:hyperlink r:id="rId10">
+        <w:r>
+          <w:rPr>
+            <w:color w:val="1155cc"/>
+            <w:sz w:val="21"/>
+            <w:szCs w:val="21"/>
+            <w:u w:val="single"/>
+            <w:rtl w:val="0"/>
+          </w:rPr>
+          <w:t xml:space="preserve">Git for Windows</w:t>
+        </w:r>
+      </w:hyperlink>
+      <w:r>
+        <w:rPr>
+          <w:color w:val="24292e"/>
+          <w:sz w:val="21"/>
+          <w:szCs w:val="21"/>
+          <w:rtl w:val="0"/>
+        </w:rPr>
+        <w:t xml:space="preserve"> and open Git Bash. Git Bash is not Linux or Unix. It supplies Bash, Git, and common Unix-style commands inside Windows, so paths and system tools can differ. The Bashcrawl commands used here are mostly the same.</w:t>
+      </w:r>
+      <w:r>
+        <w:rPr>
+          <w:rtl w:val="0"/>
+        </w:rPr>
+      </w:r>
+    </w:p>
+    <w:p>
+      <w:pPr>
+        <w:spacing w:after="120" w:before="0" w:lineRule="auto"/>
+        <w:rPr>
+          <w:color w:val="24292e"/>
+          <w:sz w:val="21"/>
+          <w:szCs w:val="21"/>
+        </w:rPr>
+      </w:pPr>
+      <w:r>
+        <w:rPr>
+          <w:color w:val="24292e"/>
+          <w:sz w:val="21"/>
+          <w:szCs w:val="21"/>
+          <w:rtl w:val="0"/>
+        </w:rPr>
         <w:t xml:space="preserve">Linux Mint / Ubuntu: Press Ctrl + Alt + T, or open Terminal from the application menu.</w:t>
       </w:r>
     </w:p>
@@ -779,6 +943,25 @@
           <w:rtl w:val="0"/>
         </w:rPr>
         <w:t xml:space="preserve">Mac: Press Command + Space, search Terminal, and press Return.</w:t>
+      </w:r>
+    </w:p>
+    <w:p>
+      <w:pPr>
+        <w:spacing w:after="120" w:before="0" w:lineRule="auto"/>
+        <w:rPr>
+          <w:color w:val="24292e"/>
+          <w:sz w:val="21"/>
+          <w:szCs w:val="21"/>
+        </w:rPr>
+      </w:pPr>
+      <w:r>
+        <w:rPr>
+          <w:color w:val="24292e"/>
+          <w:sz w:val="21"/>
+          <w:szCs w:val="21"/>
+          <w:rtl w:val="0"/>
+        </w:rPr>
+        <w:t xml:space="preserve">Chromebook: On a personal Chromebook or owner account, enable Settings &gt; About ChromeOS &gt; Developers &gt; Linux development environment &gt; Set up. Setup needs Internet. Open Terminal from the Launcher afterward. A school-managed Chromebook may block this feature. Do not use Developer Mode or bypass school management.</w:t>
       </w:r>
     </w:p>
     <w:p>
@@ -814,7 +997,7 @@
         </w:rPr>
         <w:t xml:space="preserve">Android: Install </w:t>
       </w:r>
-      <w:hyperlink r:id="rId8">
+      <w:hyperlink r:id="rId11">
         <w:r>
           <w:rPr>
             <w:color w:val="1155cc"/>
@@ -892,7 +1075,7 @@
         </w:rPr>
         <w:t xml:space="preserve">iPhone or iPad: Install </w:t>
       </w:r>
-      <w:hyperlink r:id="rId9">
+      <w:hyperlink r:id="rId12">
         <w:r>
           <w:rPr>
             <w:color w:val="1155cc"/>
@@ -1095,297 +1278,13 @@
         <w:spacing w:after="100" w:before="240" w:lineRule="auto"/>
         <w:rPr/>
       </w:pPr>
-      <w:bookmarkStart w:colFirst="0" w:colLast="0" w:name="_8fxa0tsobz3r" w:id="6"/>
+      <w:bookmarkStart w:colFirst="0" w:colLast="0" w:name="_ih4j7eo9x5pq" w:id="6"/>
       <w:bookmarkEnd w:id="6"/>
       <w:r>
         <w:rPr>
           <w:rtl w:val="0"/>
         </w:rPr>
         <w:t xml:space="preserve">2. DOWNLOAD AND START BASHCRAWL</w:t>
-      </w:r>
-    </w:p>
-    <w:p>
-      <w:pPr>
-        <w:spacing w:after="120" w:before="0" w:lineRule="auto"/>
-        <w:rPr>
-          <w:color w:val="24292e"/>
-          <w:sz w:val="21"/>
-          <w:szCs w:val="21"/>
-        </w:rPr>
-      </w:pPr>
-      <w:r>
-        <w:rPr>
-          <w:color w:val="24292e"/>
-          <w:sz w:val="21"/>
-          <w:szCs w:val="21"/>
-          <w:rtl w:val="0"/>
-        </w:rPr>
-        <w:t xml:space="preserve">Copy ONE command at a time into your Linux or Mac terminal. Press Enter after each line. Do not type a $ prompt symbol.</w:t>
-      </w:r>
-    </w:p>
-    <w:p>
-      <w:pPr>
-        <w:spacing w:after="20" w:before="20" w:lineRule="auto"/>
-        <w:ind w:left="280"/>
-        <w:rPr>
-          <w:rFonts w:ascii="Courier New" w:cs="Courier New" w:eastAsia="Courier New" w:hAnsi="Courier New"/>
-          <w:color w:val="24292e"/>
-          <w:sz w:val="21"/>
-          <w:szCs w:val="21"/>
-        </w:rPr>
-      </w:pPr>
-      <w:r>
-        <w:rPr>
-          <w:rFonts w:ascii="Courier New" w:cs="Courier New" w:eastAsia="Courier New" w:hAnsi="Courier New"/>
-          <w:color w:val="24292e"/>
-          <w:sz w:val="21"/>
-          <w:szCs w:val="21"/>
-          <w:rtl w:val="0"/>
-        </w:rPr>
-        <w:t xml:space="preserve">cd ~</w:t>
-      </w:r>
-    </w:p>
-    <w:p>
-      <w:pPr>
-        <w:spacing w:after="60" w:before="0" w:lineRule="auto"/>
-        <w:rPr>
-          <w:color w:val="24292e"/>
-          <w:sz w:val="20"/>
-          <w:szCs w:val="20"/>
-        </w:rPr>
-      </w:pPr>
-      <w:r>
-        <w:rPr>
-          <w:color w:val="24292e"/>
-          <w:sz w:val="20"/>
-          <w:szCs w:val="20"/>
-          <w:rtl w:val="0"/>
-        </w:rPr>
-        <w:t xml:space="preserve">cd means Change Directory (move to a folder). ~ is your home folder.</w:t>
-      </w:r>
-    </w:p>
-    <w:p>
-      <w:pPr>
-        <w:spacing w:after="20" w:before="20" w:lineRule="auto"/>
-        <w:ind w:left="280"/>
-        <w:rPr>
-          <w:rFonts w:ascii="Courier New" w:cs="Courier New" w:eastAsia="Courier New" w:hAnsi="Courier New"/>
-          <w:color w:val="24292e"/>
-          <w:sz w:val="21"/>
-          <w:szCs w:val="21"/>
-        </w:rPr>
-      </w:pPr>
-      <w:r>
-        <w:rPr>
-          <w:rFonts w:ascii="Courier New" w:cs="Courier New" w:eastAsia="Courier New" w:hAnsi="Courier New"/>
-          <w:color w:val="24292e"/>
-          <w:sz w:val="21"/>
-          <w:szCs w:val="21"/>
-          <w:rtl w:val="0"/>
-        </w:rPr>
-        <w:t xml:space="preserve">mkdir -p Games</w:t>
-      </w:r>
-    </w:p>
-    <w:p>
-      <w:pPr>
-        <w:spacing w:after="60" w:before="0" w:lineRule="auto"/>
-        <w:rPr>
-          <w:color w:val="24292e"/>
-          <w:sz w:val="20"/>
-          <w:szCs w:val="20"/>
-        </w:rPr>
-      </w:pPr>
-      <w:r>
-        <w:rPr>
-          <w:color w:val="24292e"/>
-          <w:sz w:val="20"/>
-          <w:szCs w:val="20"/>
-          <w:rtl w:val="0"/>
-        </w:rPr>
-        <w:t xml:space="preserve">mkdir means Make Directory (create a folder). Games is the new folder name.</w:t>
-      </w:r>
-    </w:p>
-    <w:p>
-      <w:pPr>
-        <w:spacing w:after="20" w:before="20" w:lineRule="auto"/>
-        <w:ind w:left="280"/>
-        <w:rPr>
-          <w:rFonts w:ascii="Courier New" w:cs="Courier New" w:eastAsia="Courier New" w:hAnsi="Courier New"/>
-          <w:color w:val="24292e"/>
-          <w:sz w:val="21"/>
-          <w:szCs w:val="21"/>
-        </w:rPr>
-      </w:pPr>
-      <w:r>
-        <w:rPr>
-          <w:rFonts w:ascii="Courier New" w:cs="Courier New" w:eastAsia="Courier New" w:hAnsi="Courier New"/>
-          <w:color w:val="24292e"/>
-          <w:sz w:val="21"/>
-          <w:szCs w:val="21"/>
-          <w:rtl w:val="0"/>
-        </w:rPr>
-        <w:t xml:space="preserve">cd Games</w:t>
-      </w:r>
-    </w:p>
-    <w:p>
-      <w:pPr>
-        <w:spacing w:after="60" w:before="0" w:lineRule="auto"/>
-        <w:rPr>
-          <w:color w:val="24292e"/>
-          <w:sz w:val="20"/>
-          <w:szCs w:val="20"/>
-        </w:rPr>
-      </w:pPr>
-      <w:r>
-        <w:rPr>
-          <w:color w:val="24292e"/>
-          <w:sz w:val="20"/>
-          <w:szCs w:val="20"/>
-          <w:rtl w:val="0"/>
-        </w:rPr>
-        <w:t xml:space="preserve">Move inside the Games folder.</w:t>
-      </w:r>
-    </w:p>
-    <w:p>
-      <w:pPr>
-        <w:spacing w:after="20" w:before="20" w:lineRule="auto"/>
-        <w:ind w:left="280"/>
-        <w:rPr>
-          <w:rFonts w:ascii="Courier New" w:cs="Courier New" w:eastAsia="Courier New" w:hAnsi="Courier New"/>
-          <w:color w:val="24292e"/>
-          <w:sz w:val="21"/>
-          <w:szCs w:val="21"/>
-        </w:rPr>
-      </w:pPr>
-      <w:r>
-        <w:rPr>
-          <w:rFonts w:ascii="Courier New" w:cs="Courier New" w:eastAsia="Courier New" w:hAnsi="Courier New"/>
-          <w:color w:val="24292e"/>
-          <w:sz w:val="21"/>
-          <w:szCs w:val="21"/>
-          <w:rtl w:val="0"/>
-        </w:rPr>
-        <w:t xml:space="preserve">git clone https://gitlab.com/slackermedia/bashcrawl.git</w:t>
-      </w:r>
-    </w:p>
-    <w:p>
-      <w:pPr>
-        <w:spacing w:after="60" w:before="0" w:lineRule="auto"/>
-        <w:rPr>
-          <w:color w:val="24292e"/>
-          <w:sz w:val="20"/>
-          <w:szCs w:val="20"/>
-        </w:rPr>
-      </w:pPr>
-      <w:r>
-        <w:rPr>
-          <w:color w:val="24292e"/>
-          <w:sz w:val="20"/>
-          <w:szCs w:val="20"/>
-          <w:rtl w:val="0"/>
-        </w:rPr>
-        <w:t xml:space="preserve">git clone makes a copy of the Bashcrawl game on your computer. If you already downloaded it here, skip this command.</w:t>
-      </w:r>
-    </w:p>
-    <w:p>
-      <w:pPr>
-        <w:spacing w:after="20" w:before="20" w:lineRule="auto"/>
-        <w:ind w:left="280"/>
-        <w:rPr>
-          <w:rFonts w:ascii="Courier New" w:cs="Courier New" w:eastAsia="Courier New" w:hAnsi="Courier New"/>
-          <w:color w:val="24292e"/>
-          <w:sz w:val="21"/>
-          <w:szCs w:val="21"/>
-        </w:rPr>
-      </w:pPr>
-      <w:r>
-        <w:rPr>
-          <w:rFonts w:ascii="Courier New" w:cs="Courier New" w:eastAsia="Courier New" w:hAnsi="Courier New"/>
-          <w:color w:val="24292e"/>
-          <w:sz w:val="21"/>
-          <w:szCs w:val="21"/>
-          <w:rtl w:val="0"/>
-        </w:rPr>
-        <w:t xml:space="preserve">cd bashcrawl/entrance</w:t>
-      </w:r>
-    </w:p>
-    <w:p>
-      <w:pPr>
-        <w:spacing w:after="60" w:before="0" w:lineRule="auto"/>
-        <w:rPr>
-          <w:color w:val="24292e"/>
-          <w:sz w:val="20"/>
-          <w:szCs w:val="20"/>
-        </w:rPr>
-      </w:pPr>
-      <w:r>
-        <w:rPr>
-          <w:color w:val="24292e"/>
-          <w:sz w:val="20"/>
-          <w:szCs w:val="20"/>
-          <w:rtl w:val="0"/>
-        </w:rPr>
-        <w:t xml:space="preserve">Move to the game's entrance. If you played before, you can start again with </w:t>
-      </w:r>
-      <w:r>
-        <w:rPr>
-          <w:rFonts w:ascii="Courier New" w:cs="Courier New" w:eastAsia="Courier New" w:hAnsi="Courier New"/>
-          <w:color w:val="24292e"/>
-          <w:sz w:val="20"/>
-          <w:szCs w:val="20"/>
-          <w:rtl w:val="0"/>
-        </w:rPr>
-        <w:t xml:space="preserve">cd ~/Games/bashcrawl/entrance</w:t>
-      </w:r>
-      <w:r>
-        <w:rPr>
-          <w:color w:val="24292e"/>
-          <w:sz w:val="20"/>
-          <w:szCs w:val="20"/>
-          <w:rtl w:val="0"/>
-        </w:rPr>
-        <w:t xml:space="preserve">.</w:t>
-      </w:r>
-    </w:p>
-    <w:p>
-      <w:pPr>
-        <w:spacing w:after="20" w:before="20" w:lineRule="auto"/>
-        <w:ind w:left="280"/>
-        <w:rPr>
-          <w:rFonts w:ascii="Courier New" w:cs="Courier New" w:eastAsia="Courier New" w:hAnsi="Courier New"/>
-          <w:color w:val="24292e"/>
-          <w:sz w:val="21"/>
-          <w:szCs w:val="21"/>
-        </w:rPr>
-      </w:pPr>
-      <w:r>
-        <w:rPr>
-          <w:rFonts w:ascii="Courier New" w:cs="Courier New" w:eastAsia="Courier New" w:hAnsi="Courier New"/>
-          <w:color w:val="24292e"/>
-          <w:sz w:val="21"/>
-          <w:szCs w:val="21"/>
-          <w:rtl w:val="0"/>
-        </w:rPr>
-        <w:t xml:space="preserve">cat scroll</w:t>
-      </w:r>
-    </w:p>
-    <w:p>
-      <w:pPr>
-        <w:spacing w:after="60" w:before="0" w:lineRule="auto"/>
-        <w:rPr>
-          <w:color w:val="24292e"/>
-          <w:sz w:val="20"/>
-          <w:szCs w:val="20"/>
-        </w:rPr>
-      </w:pPr>
-      <w:r>
-        <w:rPr>
-          <w:color w:val="24292e"/>
-          <w:sz w:val="20"/>
-          <w:szCs w:val="20"/>
-          <w:rtl w:val="0"/>
-        </w:rPr>
-        <w:t xml:space="preserve">cat reads a file. The argument scroll tells cat which file to show. The first scroll explains how to begin.</w:t>
       </w:r>
     </w:p>
     <w:p>
@@ -1395,435 +1294,13 @@
         <w:spacing w:after="100" w:before="240" w:lineRule="auto"/>
         <w:rPr/>
       </w:pPr>
-      <w:bookmarkStart w:colFirst="0" w:colLast="0" w:name="_n16kkfunxk0n" w:id="7"/>
+      <w:bookmarkStart w:colFirst="0" w:colLast="0" w:name="_3l82ktjhvztj" w:id="7"/>
       <w:bookmarkEnd w:id="7"/>
       <w:r>
         <w:rPr>
           <w:rtl w:val="0"/>
         </w:rPr>
-        <w:t xml:space="preserve">3. LEARN THE MOVES, THEN EXPLORE</w:t>
-      </w:r>
-    </w:p>
-    <w:p>
-      <w:pPr>
-        <w:spacing w:after="120" w:before="0" w:lineRule="auto"/>
-        <w:rPr>
-          <w:color w:val="24292e"/>
-          <w:sz w:val="21"/>
-          <w:szCs w:val="21"/>
-        </w:rPr>
-      </w:pPr>
-      <w:r>
-        <w:rPr>
-          <w:color w:val="24292e"/>
-          <w:sz w:val="21"/>
-          <w:szCs w:val="21"/>
-          <w:rtl w:val="0"/>
-        </w:rPr>
-        <w:t xml:space="preserve">Your objective: follow the clues and get as far into the dungeon as possible. Look at what is in each room, read clues, and choose where to go next. There is no worksheet telling you every move.</w:t>
-      </w:r>
-    </w:p>
-    <w:p>
-      <w:pPr>
-        <w:spacing w:after="120" w:before="0" w:lineRule="auto"/>
-        <w:rPr>
-          <w:color w:val="24292e"/>
-          <w:sz w:val="21"/>
-          <w:szCs w:val="21"/>
-        </w:rPr>
-      </w:pPr>
-      <w:r>
-        <w:rPr>
-          <w:color w:val="24292e"/>
-          <w:sz w:val="21"/>
-          <w:szCs w:val="21"/>
-          <w:rtl w:val="0"/>
-        </w:rPr>
-        <w:t xml:space="preserve">Example of what the terminal might look like (the $ is the prompt, not something to type):</w:t>
-      </w:r>
-    </w:p>
-    <w:p>
-      <w:pPr>
-        <w:spacing w:after="20" w:before="20" w:lineRule="auto"/>
-        <w:ind w:left="280"/>
-        <w:rPr>
-          <w:rFonts w:ascii="Courier New" w:cs="Courier New" w:eastAsia="Courier New" w:hAnsi="Courier New"/>
-          <w:color w:val="0072b2"/>
-          <w:sz w:val="21"/>
-          <w:szCs w:val="21"/>
-        </w:rPr>
-      </w:pPr>
-      <w:r>
-        <w:rPr>
-          <w:rFonts w:ascii="Courier New" w:cs="Courier New" w:eastAsia="Courier New" w:hAnsi="Courier New"/>
-          <w:b w:val="1"/>
-          <w:bCs w:val="1"/>
-          <w:color w:val="0072b2"/>
-          <w:sz w:val="21"/>
-          <w:szCs w:val="21"/>
-          <w:rtl w:val="0"/>
-        </w:rPr>
-        <w:t xml:space="preserve">$ </w:t>
-      </w:r>
-      <w:r>
-        <w:rPr>
-          <w:rFonts w:ascii="Courier New" w:cs="Courier New" w:eastAsia="Courier New" w:hAnsi="Courier New"/>
-          <w:color w:val="0072b2"/>
-          <w:sz w:val="21"/>
-          <w:szCs w:val="21"/>
-          <w:rtl w:val="0"/>
-        </w:rPr>
-        <w:t xml:space="preserve">ls</w:t>
-      </w:r>
-    </w:p>
-    <w:p>
-      <w:pPr>
-        <w:spacing w:after="20" w:before="20" w:lineRule="auto"/>
-        <w:ind w:left="280"/>
-        <w:rPr>
-          <w:rFonts w:ascii="Courier New" w:cs="Courier New" w:eastAsia="Courier New" w:hAnsi="Courier New"/>
-          <w:color w:val="24292e"/>
-          <w:sz w:val="21"/>
-          <w:szCs w:val="21"/>
-        </w:rPr>
-      </w:pPr>
-      <w:r>
-        <w:rPr>
-          <w:rFonts w:ascii="Courier New" w:cs="Courier New" w:eastAsia="Courier New" w:hAnsi="Courier New"/>
-          <w:color w:val="24292e"/>
-          <w:sz w:val="21"/>
-          <w:szCs w:val="21"/>
-          <w:rtl w:val="0"/>
-        </w:rPr>
-        <w:t xml:space="preserve">cellar  scroll</w:t>
-      </w:r>
-    </w:p>
-    <w:p>
-      <w:pPr>
-        <w:spacing w:after="20" w:before="20" w:lineRule="auto"/>
-        <w:ind w:left="280"/>
-        <w:rPr>
-          <w:rFonts w:ascii="Courier New" w:cs="Courier New" w:eastAsia="Courier New" w:hAnsi="Courier New"/>
-          <w:color w:val="0072b2"/>
-          <w:sz w:val="21"/>
-          <w:szCs w:val="21"/>
-        </w:rPr>
-      </w:pPr>
-      <w:r>
-        <w:rPr>
-          <w:rFonts w:ascii="Courier New" w:cs="Courier New" w:eastAsia="Courier New" w:hAnsi="Courier New"/>
-          <w:b w:val="1"/>
-          <w:bCs w:val="1"/>
-          <w:color w:val="0072b2"/>
-          <w:sz w:val="21"/>
-          <w:szCs w:val="21"/>
-          <w:rtl w:val="0"/>
-        </w:rPr>
-        <w:t xml:space="preserve">$ </w:t>
-      </w:r>
-      <w:r>
-        <w:rPr>
-          <w:rFonts w:ascii="Courier New" w:cs="Courier New" w:eastAsia="Courier New" w:hAnsi="Courier New"/>
-          <w:color w:val="0072b2"/>
-          <w:sz w:val="21"/>
-          <w:szCs w:val="21"/>
-          <w:rtl w:val="0"/>
-        </w:rPr>
-        <w:t xml:space="preserve">cat scroll</w:t>
-      </w:r>
-    </w:p>
-    <w:p>
-      <w:pPr>
-        <w:spacing w:after="20" w:before="20" w:lineRule="auto"/>
-        <w:ind w:left="280"/>
-        <w:rPr>
-          <w:rFonts w:ascii="Courier New" w:cs="Courier New" w:eastAsia="Courier New" w:hAnsi="Courier New"/>
-          <w:color w:val="24292e"/>
-          <w:sz w:val="21"/>
-          <w:szCs w:val="21"/>
-        </w:rPr>
-      </w:pPr>
-      <w:r>
-        <w:rPr>
-          <w:rFonts w:ascii="Courier New" w:cs="Courier New" w:eastAsia="Courier New" w:hAnsi="Courier New"/>
-          <w:color w:val="24292e"/>
-          <w:sz w:val="21"/>
-          <w:szCs w:val="21"/>
-          <w:rtl w:val="0"/>
-        </w:rPr>
-        <w:t xml:space="preserve">[The game displays a clue.]</w:t>
-      </w:r>
-    </w:p>
-    <w:p>
-      <w:pPr>
-        <w:spacing w:after="20" w:before="20" w:lineRule="auto"/>
-        <w:ind w:left="280"/>
-        <w:rPr>
-          <w:rFonts w:ascii="Courier New" w:cs="Courier New" w:eastAsia="Courier New" w:hAnsi="Courier New"/>
-          <w:b w:val="1"/>
-          <w:bCs w:val="1"/>
-          <w:color w:val="0072b2"/>
-          <w:sz w:val="21"/>
-          <w:szCs w:val="21"/>
-        </w:rPr>
-      </w:pPr>
-      <w:r>
-        <w:rPr>
-          <w:rFonts w:ascii="Courier New" w:cs="Courier New" w:eastAsia="Courier New" w:hAnsi="Courier New"/>
-          <w:b w:val="1"/>
-          <w:bCs w:val="1"/>
-          <w:color w:val="0072b2"/>
-          <w:sz w:val="21"/>
-          <w:szCs w:val="21"/>
-          <w:rtl w:val="0"/>
-        </w:rPr>
-        <w:t xml:space="preserve">$ cd cellar</w:t>
-      </w:r>
-    </w:p>
-    <w:p>
-      <w:pPr>
-        <w:spacing w:after="20" w:before="20" w:lineRule="auto"/>
-        <w:ind w:left="280"/>
-        <w:rPr>
-          <w:rFonts w:ascii="Courier New" w:cs="Courier New" w:eastAsia="Courier New" w:hAnsi="Courier New"/>
-          <w:color w:val="0072b2"/>
-          <w:sz w:val="21"/>
-          <w:szCs w:val="21"/>
-        </w:rPr>
-      </w:pPr>
-      <w:r>
-        <w:rPr>
-          <w:rFonts w:ascii="Courier New" w:cs="Courier New" w:eastAsia="Courier New" w:hAnsi="Courier New"/>
-          <w:b w:val="1"/>
-          <w:bCs w:val="1"/>
-          <w:color w:val="0072b2"/>
-          <w:sz w:val="21"/>
-          <w:szCs w:val="21"/>
-          <w:rtl w:val="0"/>
-        </w:rPr>
-        <w:t xml:space="preserve">$ </w:t>
-      </w:r>
-      <w:r>
-        <w:rPr>
-          <w:rFonts w:ascii="Courier New" w:cs="Courier New" w:eastAsia="Courier New" w:hAnsi="Courier New"/>
-          <w:color w:val="0072b2"/>
-          <w:sz w:val="21"/>
-          <w:szCs w:val="21"/>
-          <w:rtl w:val="0"/>
-        </w:rPr>
-        <w:t xml:space="preserve">pwd</w:t>
-      </w:r>
-    </w:p>
-    <w:p>
-      <w:pPr>
-        <w:spacing w:after="20" w:before="20" w:lineRule="auto"/>
-        <w:ind w:left="280"/>
-        <w:rPr>
-          <w:rFonts w:ascii="Courier New" w:cs="Courier New" w:eastAsia="Courier New" w:hAnsi="Courier New"/>
-          <w:color w:val="24292e"/>
-          <w:sz w:val="21"/>
-          <w:szCs w:val="21"/>
-        </w:rPr>
-      </w:pPr>
-      <w:r>
-        <w:rPr>
-          <w:rFonts w:ascii="Courier New" w:cs="Courier New" w:eastAsia="Courier New" w:hAnsi="Courier New"/>
-          <w:color w:val="24292e"/>
-          <w:sz w:val="21"/>
-          <w:szCs w:val="21"/>
-          <w:rtl w:val="0"/>
-        </w:rPr>
-        <w:t xml:space="preserve">/home/sam/Games/bashcrawl/entrance/cellar</w:t>
-      </w:r>
-    </w:p>
-    <w:p>
-      <w:pPr>
-        <w:spacing w:after="120" w:before="0" w:lineRule="auto"/>
-        <w:rPr>
-          <w:color w:val="24292e"/>
-          <w:sz w:val="21"/>
-          <w:szCs w:val="21"/>
-        </w:rPr>
-      </w:pPr>
-      <w:r>
-        <w:rPr>
-          <w:color w:val="24292e"/>
-          <w:sz w:val="21"/>
-          <w:szCs w:val="21"/>
-          <w:rtl w:val="0"/>
-        </w:rPr>
-        <w:t xml:space="preserve">Memory clues: </w:t>
-      </w:r>
-      <w:r>
-        <w:rPr>
-          <w:rFonts w:ascii="Courier New" w:cs="Courier New" w:eastAsia="Courier New" w:hAnsi="Courier New"/>
-          <w:color w:val="24292e"/>
-          <w:sz w:val="21"/>
-          <w:szCs w:val="21"/>
-          <w:rtl w:val="0"/>
-        </w:rPr>
-        <w:t xml:space="preserve">ls</w:t>
-      </w:r>
-      <w:r>
-        <w:rPr>
-          <w:color w:val="24292e"/>
-          <w:sz w:val="21"/>
-          <w:szCs w:val="21"/>
-          <w:rtl w:val="0"/>
-        </w:rPr>
-        <w:t xml:space="preserve"> = LiSt what is here; </w:t>
-      </w:r>
-      <w:r>
-        <w:rPr>
-          <w:rFonts w:ascii="Courier New" w:cs="Courier New" w:eastAsia="Courier New" w:hAnsi="Courier New"/>
-          <w:color w:val="24292e"/>
-          <w:sz w:val="21"/>
-          <w:szCs w:val="21"/>
-          <w:rtl w:val="0"/>
-        </w:rPr>
-        <w:t xml:space="preserve">pwd</w:t>
-      </w:r>
-      <w:r>
-        <w:rPr>
-          <w:color w:val="24292e"/>
-          <w:sz w:val="21"/>
-          <w:szCs w:val="21"/>
-          <w:rtl w:val="0"/>
-        </w:rPr>
-        <w:t xml:space="preserve"> = Print Working Directory (where am I?); </w:t>
-      </w:r>
-      <w:r>
-        <w:rPr>
-          <w:rFonts w:ascii="Courier New" w:cs="Courier New" w:eastAsia="Courier New" w:hAnsi="Courier New"/>
-          <w:color w:val="24292e"/>
-          <w:sz w:val="21"/>
-          <w:szCs w:val="21"/>
-          <w:rtl w:val="0"/>
-        </w:rPr>
-        <w:t xml:space="preserve">cd roomname</w:t>
-      </w:r>
-      <w:r>
-        <w:rPr>
-          <w:color w:val="24292e"/>
-          <w:sz w:val="21"/>
-          <w:szCs w:val="21"/>
-          <w:rtl w:val="0"/>
-        </w:rPr>
-        <w:t xml:space="preserve"> = move into that room; </w:t>
-      </w:r>
-      <w:r>
-        <w:rPr>
-          <w:rFonts w:ascii="Courier New" w:cs="Courier New" w:eastAsia="Courier New" w:hAnsi="Courier New"/>
-          <w:color w:val="24292e"/>
-          <w:sz w:val="21"/>
-          <w:szCs w:val="21"/>
-          <w:rtl w:val="0"/>
-        </w:rPr>
-        <w:t xml:space="preserve">cd ..</w:t>
-      </w:r>
-      <w:r>
-        <w:rPr>
-          <w:color w:val="24292e"/>
-          <w:sz w:val="21"/>
-          <w:szCs w:val="21"/>
-          <w:rtl w:val="0"/>
-        </w:rPr>
-        <w:t xml:space="preserve"> = go back; </w:t>
-      </w:r>
-      <w:r>
-        <w:rPr>
-          <w:rFonts w:ascii="Courier New" w:cs="Courier New" w:eastAsia="Courier New" w:hAnsi="Courier New"/>
-          <w:color w:val="24292e"/>
-          <w:sz w:val="21"/>
-          <w:szCs w:val="21"/>
-          <w:rtl w:val="0"/>
-        </w:rPr>
-        <w:t xml:space="preserve">cat filename</w:t>
-      </w:r>
-      <w:r>
-        <w:rPr>
-          <w:color w:val="24292e"/>
-          <w:sz w:val="21"/>
-          <w:szCs w:val="21"/>
-          <w:rtl w:val="0"/>
-        </w:rPr>
-        <w:t xml:space="preserve"> = read a clue; </w:t>
-      </w:r>
-      <w:r>
-        <w:rPr>
-          <w:rFonts w:ascii="Courier New" w:cs="Courier New" w:eastAsia="Courier New" w:hAnsi="Courier New"/>
-          <w:color w:val="24292e"/>
-          <w:sz w:val="21"/>
-          <w:szCs w:val="21"/>
-          <w:rtl w:val="0"/>
-        </w:rPr>
-        <w:t xml:space="preserve">ls -a</w:t>
-      </w:r>
-      <w:r>
-        <w:rPr>
-          <w:color w:val="24292e"/>
-          <w:sz w:val="21"/>
-          <w:szCs w:val="21"/>
-          <w:rtl w:val="0"/>
-        </w:rPr>
-        <w:t xml:space="preserve"> = list ALL, including hidden items.</w:t>
-      </w:r>
-    </w:p>
-    <w:p>
-      <w:pPr>
-        <w:spacing w:after="120" w:before="0" w:lineRule="auto"/>
-        <w:rPr>
-          <w:color w:val="24292e"/>
-          <w:sz w:val="21"/>
-          <w:szCs w:val="21"/>
-        </w:rPr>
-      </w:pPr>
-      <w:r>
-        <w:rPr>
-          <w:color w:val="24292e"/>
-          <w:sz w:val="21"/>
-          <w:szCs w:val="21"/>
-          <w:rtl w:val="0"/>
-        </w:rPr>
-        <w:t xml:space="preserve">If you see a file called scroll, read it using </w:t>
-      </w:r>
-      <w:r>
-        <w:rPr>
-          <w:rFonts w:ascii="Courier New" w:cs="Courier New" w:eastAsia="Courier New" w:hAnsi="Courier New"/>
-          <w:color w:val="24292e"/>
-          <w:sz w:val="21"/>
-          <w:szCs w:val="21"/>
-          <w:rtl w:val="0"/>
-        </w:rPr>
-        <w:t xml:space="preserve">cat scroll</w:t>
-      </w:r>
-      <w:r>
-        <w:rPr>
-          <w:color w:val="24292e"/>
-          <w:sz w:val="21"/>
-          <w:szCs w:val="21"/>
-          <w:rtl w:val="0"/>
-        </w:rPr>
-        <w:t xml:space="preserve">. If a command does not work, read the message carefully and try another idea. Do not use </w:t>
-      </w:r>
-      <w:r>
-        <w:rPr>
-          <w:rFonts w:ascii="Courier New" w:cs="Courier New" w:eastAsia="Courier New" w:hAnsi="Courier New"/>
-          <w:color w:val="24292e"/>
-          <w:sz w:val="21"/>
-          <w:szCs w:val="21"/>
-          <w:rtl w:val="0"/>
-        </w:rPr>
-        <w:t xml:space="preserve">sudo</w:t>
-      </w:r>
-      <w:r>
-        <w:rPr>
-          <w:color w:val="24292e"/>
-          <w:sz w:val="21"/>
-          <w:szCs w:val="21"/>
-          <w:rtl w:val="0"/>
-        </w:rPr>
-        <w:t xml:space="preserve"> inside the game.</w:t>
+        <w:t xml:space="preserve">OFFLINE OPTION: If the TEJ Linux Offline Kit is already on your computer or USB drive, you do not need Git or Internet. Extract the kit, copy the complete bashcrawl folder into ~/Games, then run cd ~/Games/bashcrawl/entrance and cat scroll. On a Chromebook, first move the bashcrawl folder into Linux files. Terminal setup must be completed while online, but the included game works offline afterward.</w:t>
       </w:r>
     </w:p>
     <w:p>
@@ -1833,8 +1310,751 @@
         <w:spacing w:after="100" w:before="240" w:lineRule="auto"/>
         <w:rPr/>
       </w:pPr>
-      <w:bookmarkStart w:colFirst="0" w:colLast="0" w:name="_sapato8136ym" w:id="8"/>
+      <w:bookmarkStart w:colFirst="0" w:colLast="0" w:name="_8fxa0tsobz3r" w:id="8"/>
       <w:bookmarkEnd w:id="8"/>
+      <w:r>
+        <w:rPr>
+          <w:rtl w:val="0"/>
+        </w:rPr>
+        <w:t xml:space="preserve">The core Bashcrawl commands are mostly the same in WSL, Git Bash, Linux, macOS, ChromeOS Linux, Termux, and iSH: ls, cd, pwd, cat, and git clone. The prompt, home-folder path, permissions, and available system commands may differ.</w:t>
+      </w:r>
+      <w:r>
+        <w:rPr>
+          <w:rtl w:val="0"/>
+        </w:rPr>
+      </w:r>
+    </w:p>
+    <w:p>
+      <w:pPr>
+        <w:spacing w:after="120" w:before="0" w:lineRule="auto"/>
+        <w:rPr>
+          <w:color w:val="24292e"/>
+          <w:sz w:val="21"/>
+          <w:szCs w:val="21"/>
+        </w:rPr>
+      </w:pPr>
+      <w:r>
+        <w:rPr>
+          <w:color w:val="24292e"/>
+          <w:sz w:val="21"/>
+          <w:szCs w:val="21"/>
+          <w:rtl w:val="0"/>
+        </w:rPr>
+        <w:t xml:space="preserve">Copy ONE command at a time into your Linux or Mac terminal. Press Enter after each line. Do not type a $ prompt symbol.</w:t>
+      </w:r>
+    </w:p>
+    <w:p>
+      <w:pPr>
+        <w:spacing w:after="20" w:before="20" w:lineRule="auto"/>
+        <w:ind w:left="280"/>
+        <w:rPr>
+          <w:rFonts w:ascii="Courier New" w:cs="Courier New" w:eastAsia="Courier New" w:hAnsi="Courier New"/>
+          <w:color w:val="24292e"/>
+          <w:sz w:val="21"/>
+          <w:szCs w:val="21"/>
+        </w:rPr>
+      </w:pPr>
+      <w:r>
+        <w:rPr>
+          <w:rFonts w:ascii="Courier New" w:cs="Courier New" w:eastAsia="Courier New" w:hAnsi="Courier New"/>
+          <w:color w:val="24292e"/>
+          <w:sz w:val="21"/>
+          <w:szCs w:val="21"/>
+          <w:rtl w:val="0"/>
+        </w:rPr>
+        <w:t xml:space="preserve">cd ~</w:t>
+      </w:r>
+    </w:p>
+    <w:p>
+      <w:pPr>
+        <w:spacing w:after="60" w:before="0" w:lineRule="auto"/>
+        <w:rPr>
+          <w:color w:val="24292e"/>
+          <w:sz w:val="20"/>
+          <w:szCs w:val="20"/>
+        </w:rPr>
+      </w:pPr>
+      <w:r>
+        <w:rPr>
+          <w:color w:val="24292e"/>
+          <w:sz w:val="20"/>
+          <w:szCs w:val="20"/>
+          <w:rtl w:val="0"/>
+        </w:rPr>
+        <w:t xml:space="preserve">cd means Change Directory (move to a folder). ~ is your home folder.</w:t>
+      </w:r>
+    </w:p>
+    <w:p>
+      <w:pPr>
+        <w:spacing w:after="20" w:before="20" w:lineRule="auto"/>
+        <w:ind w:left="280"/>
+        <w:rPr>
+          <w:rFonts w:ascii="Courier New" w:cs="Courier New" w:eastAsia="Courier New" w:hAnsi="Courier New"/>
+          <w:color w:val="24292e"/>
+          <w:sz w:val="21"/>
+          <w:szCs w:val="21"/>
+        </w:rPr>
+      </w:pPr>
+      <w:r>
+        <w:rPr>
+          <w:rFonts w:ascii="Courier New" w:cs="Courier New" w:eastAsia="Courier New" w:hAnsi="Courier New"/>
+          <w:color w:val="24292e"/>
+          <w:sz w:val="21"/>
+          <w:szCs w:val="21"/>
+          <w:rtl w:val="0"/>
+        </w:rPr>
+        <w:t xml:space="preserve">mkdir -p Games</w:t>
+      </w:r>
+    </w:p>
+    <w:p>
+      <w:pPr>
+        <w:spacing w:after="60" w:before="0" w:lineRule="auto"/>
+        <w:rPr>
+          <w:color w:val="24292e"/>
+          <w:sz w:val="20"/>
+          <w:szCs w:val="20"/>
+        </w:rPr>
+      </w:pPr>
+      <w:r>
+        <w:rPr>
+          <w:color w:val="24292e"/>
+          <w:sz w:val="20"/>
+          <w:szCs w:val="20"/>
+          <w:rtl w:val="0"/>
+        </w:rPr>
+        <w:t xml:space="preserve">mkdir means Make Directory (create a folder). Games is the new folder name.</w:t>
+      </w:r>
+    </w:p>
+    <w:p>
+      <w:pPr>
+        <w:spacing w:after="20" w:before="20" w:lineRule="auto"/>
+        <w:ind w:left="280"/>
+        <w:rPr>
+          <w:rFonts w:ascii="Courier New" w:cs="Courier New" w:eastAsia="Courier New" w:hAnsi="Courier New"/>
+          <w:color w:val="24292e"/>
+          <w:sz w:val="21"/>
+          <w:szCs w:val="21"/>
+        </w:rPr>
+      </w:pPr>
+      <w:r>
+        <w:rPr>
+          <w:rFonts w:ascii="Courier New" w:cs="Courier New" w:eastAsia="Courier New" w:hAnsi="Courier New"/>
+          <w:color w:val="24292e"/>
+          <w:sz w:val="21"/>
+          <w:szCs w:val="21"/>
+          <w:rtl w:val="0"/>
+        </w:rPr>
+        <w:t xml:space="preserve">cd Games</w:t>
+      </w:r>
+    </w:p>
+    <w:p>
+      <w:pPr>
+        <w:spacing w:after="60" w:before="0" w:lineRule="auto"/>
+        <w:rPr>
+          <w:color w:val="24292e"/>
+          <w:sz w:val="20"/>
+          <w:szCs w:val="20"/>
+        </w:rPr>
+      </w:pPr>
+      <w:r>
+        <w:rPr>
+          <w:color w:val="24292e"/>
+          <w:sz w:val="20"/>
+          <w:szCs w:val="20"/>
+          <w:rtl w:val="0"/>
+        </w:rPr>
+        <w:t xml:space="preserve">Move inside the Games folder.</w:t>
+      </w:r>
+    </w:p>
+    <w:p>
+      <w:pPr>
+        <w:spacing w:after="20" w:before="20" w:lineRule="auto"/>
+        <w:ind w:left="280"/>
+        <w:rPr>
+          <w:rFonts w:ascii="Courier New" w:cs="Courier New" w:eastAsia="Courier New" w:hAnsi="Courier New"/>
+          <w:color w:val="24292e"/>
+          <w:sz w:val="21"/>
+          <w:szCs w:val="21"/>
+        </w:rPr>
+      </w:pPr>
+      <w:r>
+        <w:rPr>
+          <w:rFonts w:ascii="Courier New" w:cs="Courier New" w:eastAsia="Courier New" w:hAnsi="Courier New"/>
+          <w:color w:val="24292e"/>
+          <w:sz w:val="21"/>
+          <w:szCs w:val="21"/>
+          <w:rtl w:val="0"/>
+        </w:rPr>
+        <w:t xml:space="preserve">git clone https://gitlab.com/slackermedia/bashcrawl.git</w:t>
+      </w:r>
+    </w:p>
+    <w:p>
+      <w:pPr>
+        <w:spacing w:after="60" w:before="0" w:lineRule="auto"/>
+        <w:rPr>
+          <w:color w:val="24292e"/>
+          <w:sz w:val="20"/>
+          <w:szCs w:val="20"/>
+        </w:rPr>
+      </w:pPr>
+      <w:r>
+        <w:rPr>
+          <w:color w:val="24292e"/>
+          <w:sz w:val="20"/>
+          <w:szCs w:val="20"/>
+          <w:rtl w:val="0"/>
+        </w:rPr>
+        <w:t xml:space="preserve">git clone makes a copy of the Bashcrawl game on your computer. If you already downloaded it here, skip this command.</w:t>
+      </w:r>
+    </w:p>
+    <w:p>
+      <w:pPr>
+        <w:spacing w:after="20" w:before="20" w:lineRule="auto"/>
+        <w:ind w:left="280"/>
+        <w:rPr>
+          <w:rFonts w:ascii="Courier New" w:cs="Courier New" w:eastAsia="Courier New" w:hAnsi="Courier New"/>
+          <w:color w:val="24292e"/>
+          <w:sz w:val="21"/>
+          <w:szCs w:val="21"/>
+        </w:rPr>
+      </w:pPr>
+      <w:r>
+        <w:rPr>
+          <w:rFonts w:ascii="Courier New" w:cs="Courier New" w:eastAsia="Courier New" w:hAnsi="Courier New"/>
+          <w:color w:val="24292e"/>
+          <w:sz w:val="21"/>
+          <w:szCs w:val="21"/>
+          <w:rtl w:val="0"/>
+        </w:rPr>
+        <w:t xml:space="preserve">cd bashcrawl/entrance</w:t>
+      </w:r>
+    </w:p>
+    <w:p>
+      <w:pPr>
+        <w:spacing w:after="60" w:before="0" w:lineRule="auto"/>
+        <w:rPr>
+          <w:color w:val="24292e"/>
+          <w:sz w:val="20"/>
+          <w:szCs w:val="20"/>
+        </w:rPr>
+      </w:pPr>
+      <w:r>
+        <w:rPr>
+          <w:color w:val="24292e"/>
+          <w:sz w:val="20"/>
+          <w:szCs w:val="20"/>
+          <w:rtl w:val="0"/>
+        </w:rPr>
+        <w:t xml:space="preserve">Move to the game's entrance. If you played before, you can start again with </w:t>
+      </w:r>
+      <w:r>
+        <w:rPr>
+          <w:rFonts w:ascii="Courier New" w:cs="Courier New" w:eastAsia="Courier New" w:hAnsi="Courier New"/>
+          <w:color w:val="24292e"/>
+          <w:sz w:val="20"/>
+          <w:szCs w:val="20"/>
+          <w:rtl w:val="0"/>
+        </w:rPr>
+        <w:t xml:space="preserve">cd ~/Games/bashcrawl/entrance</w:t>
+      </w:r>
+      <w:r>
+        <w:rPr>
+          <w:color w:val="24292e"/>
+          <w:sz w:val="20"/>
+          <w:szCs w:val="20"/>
+          <w:rtl w:val="0"/>
+        </w:rPr>
+        <w:t xml:space="preserve">.</w:t>
+      </w:r>
+    </w:p>
+    <w:p>
+      <w:pPr>
+        <w:spacing w:after="20" w:before="20" w:lineRule="auto"/>
+        <w:ind w:left="280"/>
+        <w:rPr>
+          <w:rFonts w:ascii="Courier New" w:cs="Courier New" w:eastAsia="Courier New" w:hAnsi="Courier New"/>
+          <w:color w:val="24292e"/>
+          <w:sz w:val="21"/>
+          <w:szCs w:val="21"/>
+        </w:rPr>
+      </w:pPr>
+      <w:r>
+        <w:rPr>
+          <w:rFonts w:ascii="Courier New" w:cs="Courier New" w:eastAsia="Courier New" w:hAnsi="Courier New"/>
+          <w:color w:val="24292e"/>
+          <w:sz w:val="21"/>
+          <w:szCs w:val="21"/>
+          <w:rtl w:val="0"/>
+        </w:rPr>
+        <w:t xml:space="preserve">cat scroll</w:t>
+      </w:r>
+    </w:p>
+    <w:p>
+      <w:pPr>
+        <w:spacing w:after="60" w:before="0" w:lineRule="auto"/>
+        <w:rPr>
+          <w:color w:val="24292e"/>
+          <w:sz w:val="20"/>
+          <w:szCs w:val="20"/>
+        </w:rPr>
+      </w:pPr>
+      <w:r>
+        <w:rPr>
+          <w:color w:val="24292e"/>
+          <w:sz w:val="20"/>
+          <w:szCs w:val="20"/>
+          <w:rtl w:val="0"/>
+        </w:rPr>
+        <w:t xml:space="preserve">cat reads a file. The argument scroll tells cat which file to show. The first scroll explains how to begin.</w:t>
+      </w:r>
+    </w:p>
+    <w:p>
+      <w:pPr>
+        <w:pStyle w:val="Heading2"/>
+        <w:keepNext w:val="1"/>
+        <w:spacing w:after="100" w:before="240" w:lineRule="auto"/>
+        <w:rPr/>
+      </w:pPr>
+      <w:bookmarkStart w:colFirst="0" w:colLast="0" w:name="_n16kkfunxk0n" w:id="9"/>
+      <w:bookmarkEnd w:id="9"/>
+      <w:r>
+        <w:rPr>
+          <w:rtl w:val="0"/>
+        </w:rPr>
+        <w:t xml:space="preserve">3. LEARN THE MOVES, THEN EXPLORE</w:t>
+      </w:r>
+    </w:p>
+    <w:p>
+      <w:pPr>
+        <w:spacing w:after="120" w:before="0" w:lineRule="auto"/>
+        <w:rPr>
+          <w:color w:val="24292e"/>
+          <w:sz w:val="21"/>
+          <w:szCs w:val="21"/>
+        </w:rPr>
+      </w:pPr>
+      <w:r>
+        <w:rPr>
+          <w:color w:val="24292e"/>
+          <w:sz w:val="21"/>
+          <w:szCs w:val="21"/>
+          <w:rtl w:val="0"/>
+        </w:rPr>
+        <w:t xml:space="preserve">Your objective: follow the clues and get as far into the dungeon as possible. Look at what is in each room, read clues, and choose where to go next. There is no worksheet telling you every move.</w:t>
+      </w:r>
+    </w:p>
+    <w:p>
+      <w:pPr>
+        <w:spacing w:after="120" w:before="0" w:lineRule="auto"/>
+        <w:rPr>
+          <w:color w:val="24292e"/>
+          <w:sz w:val="21"/>
+          <w:szCs w:val="21"/>
+        </w:rPr>
+      </w:pPr>
+      <w:r>
+        <w:rPr>
+          <w:color w:val="24292e"/>
+          <w:sz w:val="21"/>
+          <w:szCs w:val="21"/>
+          <w:rtl w:val="0"/>
+        </w:rPr>
+        <w:t xml:space="preserve">Example of what the terminal might look like (the $ is the prompt, not something to type):</w:t>
+      </w:r>
+    </w:p>
+    <w:p>
+      <w:pPr>
+        <w:spacing w:after="20" w:before="20" w:lineRule="auto"/>
+        <w:ind w:left="280"/>
+        <w:rPr>
+          <w:rFonts w:ascii="Courier New" w:cs="Courier New" w:eastAsia="Courier New" w:hAnsi="Courier New"/>
+          <w:color w:val="0072b2"/>
+          <w:sz w:val="21"/>
+          <w:szCs w:val="21"/>
+        </w:rPr>
+      </w:pPr>
+      <w:r>
+        <w:rPr>
+          <w:rFonts w:ascii="Courier New" w:cs="Courier New" w:eastAsia="Courier New" w:hAnsi="Courier New"/>
+          <w:b w:val="1"/>
+          <w:bCs w:val="1"/>
+          <w:color w:val="0072b2"/>
+          <w:sz w:val="21"/>
+          <w:szCs w:val="21"/>
+          <w:rtl w:val="0"/>
+        </w:rPr>
+        <w:t xml:space="preserve">$ </w:t>
+      </w:r>
+      <w:r>
+        <w:rPr>
+          <w:rFonts w:ascii="Courier New" w:cs="Courier New" w:eastAsia="Courier New" w:hAnsi="Courier New"/>
+          <w:color w:val="0072b2"/>
+          <w:sz w:val="21"/>
+          <w:szCs w:val="21"/>
+          <w:rtl w:val="0"/>
+        </w:rPr>
+        <w:t xml:space="preserve">ls</w:t>
+      </w:r>
+    </w:p>
+    <w:p>
+      <w:pPr>
+        <w:spacing w:after="20" w:before="20" w:lineRule="auto"/>
+        <w:ind w:left="280"/>
+        <w:rPr>
+          <w:rFonts w:ascii="Courier New" w:cs="Courier New" w:eastAsia="Courier New" w:hAnsi="Courier New"/>
+          <w:color w:val="24292e"/>
+          <w:sz w:val="21"/>
+          <w:szCs w:val="21"/>
+        </w:rPr>
+      </w:pPr>
+      <w:r>
+        <w:rPr>
+          <w:rFonts w:ascii="Courier New" w:cs="Courier New" w:eastAsia="Courier New" w:hAnsi="Courier New"/>
+          <w:color w:val="24292e"/>
+          <w:sz w:val="21"/>
+          <w:szCs w:val="21"/>
+          <w:rtl w:val="0"/>
+        </w:rPr>
+        <w:t xml:space="preserve">cellar  scroll</w:t>
+      </w:r>
+    </w:p>
+    <w:p>
+      <w:pPr>
+        <w:spacing w:after="20" w:before="20" w:lineRule="auto"/>
+        <w:ind w:left="280"/>
+        <w:rPr>
+          <w:rFonts w:ascii="Courier New" w:cs="Courier New" w:eastAsia="Courier New" w:hAnsi="Courier New"/>
+          <w:color w:val="0072b2"/>
+          <w:sz w:val="21"/>
+          <w:szCs w:val="21"/>
+        </w:rPr>
+      </w:pPr>
+      <w:r>
+        <w:rPr>
+          <w:rFonts w:ascii="Courier New" w:cs="Courier New" w:eastAsia="Courier New" w:hAnsi="Courier New"/>
+          <w:b w:val="1"/>
+          <w:bCs w:val="1"/>
+          <w:color w:val="0072b2"/>
+          <w:sz w:val="21"/>
+          <w:szCs w:val="21"/>
+          <w:rtl w:val="0"/>
+        </w:rPr>
+        <w:t xml:space="preserve">$ </w:t>
+      </w:r>
+      <w:r>
+        <w:rPr>
+          <w:rFonts w:ascii="Courier New" w:cs="Courier New" w:eastAsia="Courier New" w:hAnsi="Courier New"/>
+          <w:color w:val="0072b2"/>
+          <w:sz w:val="21"/>
+          <w:szCs w:val="21"/>
+          <w:rtl w:val="0"/>
+        </w:rPr>
+        <w:t xml:space="preserve">cat scroll</w:t>
+      </w:r>
+    </w:p>
+    <w:p>
+      <w:pPr>
+        <w:spacing w:after="20" w:before="20" w:lineRule="auto"/>
+        <w:ind w:left="280"/>
+        <w:rPr>
+          <w:rFonts w:ascii="Courier New" w:cs="Courier New" w:eastAsia="Courier New" w:hAnsi="Courier New"/>
+          <w:color w:val="24292e"/>
+          <w:sz w:val="21"/>
+          <w:szCs w:val="21"/>
+        </w:rPr>
+      </w:pPr>
+      <w:r>
+        <w:rPr>
+          <w:rFonts w:ascii="Courier New" w:cs="Courier New" w:eastAsia="Courier New" w:hAnsi="Courier New"/>
+          <w:color w:val="24292e"/>
+          <w:sz w:val="21"/>
+          <w:szCs w:val="21"/>
+          <w:rtl w:val="0"/>
+        </w:rPr>
+        <w:t xml:space="preserve">[The game displays a clue.]</w:t>
+      </w:r>
+    </w:p>
+    <w:p>
+      <w:pPr>
+        <w:spacing w:after="20" w:before="20" w:lineRule="auto"/>
+        <w:ind w:left="280"/>
+        <w:rPr>
+          <w:rFonts w:ascii="Courier New" w:cs="Courier New" w:eastAsia="Courier New" w:hAnsi="Courier New"/>
+          <w:b w:val="1"/>
+          <w:bCs w:val="1"/>
+          <w:color w:val="0072b2"/>
+          <w:sz w:val="21"/>
+          <w:szCs w:val="21"/>
+        </w:rPr>
+      </w:pPr>
+      <w:r>
+        <w:rPr>
+          <w:rFonts w:ascii="Courier New" w:cs="Courier New" w:eastAsia="Courier New" w:hAnsi="Courier New"/>
+          <w:b w:val="1"/>
+          <w:bCs w:val="1"/>
+          <w:color w:val="0072b2"/>
+          <w:sz w:val="21"/>
+          <w:szCs w:val="21"/>
+          <w:rtl w:val="0"/>
+        </w:rPr>
+        <w:t xml:space="preserve">$ cd cellar</w:t>
+      </w:r>
+    </w:p>
+    <w:p>
+      <w:pPr>
+        <w:spacing w:after="20" w:before="20" w:lineRule="auto"/>
+        <w:ind w:left="280"/>
+        <w:rPr>
+          <w:rFonts w:ascii="Courier New" w:cs="Courier New" w:eastAsia="Courier New" w:hAnsi="Courier New"/>
+          <w:color w:val="0072b2"/>
+          <w:sz w:val="21"/>
+          <w:szCs w:val="21"/>
+        </w:rPr>
+      </w:pPr>
+      <w:r>
+        <w:rPr>
+          <w:rFonts w:ascii="Courier New" w:cs="Courier New" w:eastAsia="Courier New" w:hAnsi="Courier New"/>
+          <w:b w:val="1"/>
+          <w:bCs w:val="1"/>
+          <w:color w:val="0072b2"/>
+          <w:sz w:val="21"/>
+          <w:szCs w:val="21"/>
+          <w:rtl w:val="0"/>
+        </w:rPr>
+        <w:t xml:space="preserve">$ </w:t>
+      </w:r>
+      <w:r>
+        <w:rPr>
+          <w:rFonts w:ascii="Courier New" w:cs="Courier New" w:eastAsia="Courier New" w:hAnsi="Courier New"/>
+          <w:color w:val="0072b2"/>
+          <w:sz w:val="21"/>
+          <w:szCs w:val="21"/>
+          <w:rtl w:val="0"/>
+        </w:rPr>
+        <w:t xml:space="preserve">pwd</w:t>
+      </w:r>
+    </w:p>
+    <w:p>
+      <w:pPr>
+        <w:spacing w:after="20" w:before="20" w:lineRule="auto"/>
+        <w:ind w:left="280"/>
+        <w:rPr>
+          <w:rFonts w:ascii="Courier New" w:cs="Courier New" w:eastAsia="Courier New" w:hAnsi="Courier New"/>
+          <w:color w:val="24292e"/>
+          <w:sz w:val="21"/>
+          <w:szCs w:val="21"/>
+        </w:rPr>
+      </w:pPr>
+      <w:r>
+        <w:rPr>
+          <w:rFonts w:ascii="Courier New" w:cs="Courier New" w:eastAsia="Courier New" w:hAnsi="Courier New"/>
+          <w:color w:val="24292e"/>
+          <w:sz w:val="21"/>
+          <w:szCs w:val="21"/>
+          <w:rtl w:val="0"/>
+        </w:rPr>
+        <w:t xml:space="preserve">/home/sam/Games/bashcrawl/entrance/cellar</w:t>
+      </w:r>
+    </w:p>
+    <w:p>
+      <w:pPr>
+        <w:spacing w:after="120" w:before="0" w:lineRule="auto"/>
+        <w:rPr>
+          <w:color w:val="24292e"/>
+          <w:sz w:val="21"/>
+          <w:szCs w:val="21"/>
+        </w:rPr>
+      </w:pPr>
+      <w:r>
+        <w:rPr>
+          <w:color w:val="24292e"/>
+          <w:sz w:val="21"/>
+          <w:szCs w:val="21"/>
+          <w:rtl w:val="0"/>
+        </w:rPr>
+        <w:t xml:space="preserve">Memory clues: </w:t>
+      </w:r>
+      <w:r>
+        <w:rPr>
+          <w:rFonts w:ascii="Courier New" w:cs="Courier New" w:eastAsia="Courier New" w:hAnsi="Courier New"/>
+          <w:color w:val="24292e"/>
+          <w:sz w:val="21"/>
+          <w:szCs w:val="21"/>
+          <w:rtl w:val="0"/>
+        </w:rPr>
+        <w:t xml:space="preserve">ls</w:t>
+      </w:r>
+      <w:r>
+        <w:rPr>
+          <w:color w:val="24292e"/>
+          <w:sz w:val="21"/>
+          <w:szCs w:val="21"/>
+          <w:rtl w:val="0"/>
+        </w:rPr>
+        <w:t xml:space="preserve"> = LiSt what is here; </w:t>
+      </w:r>
+      <w:r>
+        <w:rPr>
+          <w:rFonts w:ascii="Courier New" w:cs="Courier New" w:eastAsia="Courier New" w:hAnsi="Courier New"/>
+          <w:color w:val="24292e"/>
+          <w:sz w:val="21"/>
+          <w:szCs w:val="21"/>
+          <w:rtl w:val="0"/>
+        </w:rPr>
+        <w:t xml:space="preserve">pwd</w:t>
+      </w:r>
+      <w:r>
+        <w:rPr>
+          <w:color w:val="24292e"/>
+          <w:sz w:val="21"/>
+          <w:szCs w:val="21"/>
+          <w:rtl w:val="0"/>
+        </w:rPr>
+        <w:t xml:space="preserve"> = Print Working Directory (where am I?); </w:t>
+      </w:r>
+      <w:r>
+        <w:rPr>
+          <w:rFonts w:ascii="Courier New" w:cs="Courier New" w:eastAsia="Courier New" w:hAnsi="Courier New"/>
+          <w:color w:val="24292e"/>
+          <w:sz w:val="21"/>
+          <w:szCs w:val="21"/>
+          <w:rtl w:val="0"/>
+        </w:rPr>
+        <w:t xml:space="preserve">cd roomname</w:t>
+      </w:r>
+      <w:r>
+        <w:rPr>
+          <w:color w:val="24292e"/>
+          <w:sz w:val="21"/>
+          <w:szCs w:val="21"/>
+          <w:rtl w:val="0"/>
+        </w:rPr>
+        <w:t xml:space="preserve"> = move into that room; </w:t>
+      </w:r>
+      <w:r>
+        <w:rPr>
+          <w:rFonts w:ascii="Courier New" w:cs="Courier New" w:eastAsia="Courier New" w:hAnsi="Courier New"/>
+          <w:color w:val="24292e"/>
+          <w:sz w:val="21"/>
+          <w:szCs w:val="21"/>
+          <w:rtl w:val="0"/>
+        </w:rPr>
+        <w:t xml:space="preserve">cd ..</w:t>
+      </w:r>
+      <w:r>
+        <w:rPr>
+          <w:color w:val="24292e"/>
+          <w:sz w:val="21"/>
+          <w:szCs w:val="21"/>
+          <w:rtl w:val="0"/>
+        </w:rPr>
+        <w:t xml:space="preserve"> = go back; </w:t>
+      </w:r>
+      <w:r>
+        <w:rPr>
+          <w:rFonts w:ascii="Courier New" w:cs="Courier New" w:eastAsia="Courier New" w:hAnsi="Courier New"/>
+          <w:color w:val="24292e"/>
+          <w:sz w:val="21"/>
+          <w:szCs w:val="21"/>
+          <w:rtl w:val="0"/>
+        </w:rPr>
+        <w:t xml:space="preserve">cat filename</w:t>
+      </w:r>
+      <w:r>
+        <w:rPr>
+          <w:color w:val="24292e"/>
+          <w:sz w:val="21"/>
+          <w:szCs w:val="21"/>
+          <w:rtl w:val="0"/>
+        </w:rPr>
+        <w:t xml:space="preserve"> = read a clue; </w:t>
+      </w:r>
+      <w:r>
+        <w:rPr>
+          <w:rFonts w:ascii="Courier New" w:cs="Courier New" w:eastAsia="Courier New" w:hAnsi="Courier New"/>
+          <w:color w:val="24292e"/>
+          <w:sz w:val="21"/>
+          <w:szCs w:val="21"/>
+          <w:rtl w:val="0"/>
+        </w:rPr>
+        <w:t xml:space="preserve">ls -a</w:t>
+      </w:r>
+      <w:r>
+        <w:rPr>
+          <w:color w:val="24292e"/>
+          <w:sz w:val="21"/>
+          <w:szCs w:val="21"/>
+          <w:rtl w:val="0"/>
+        </w:rPr>
+        <w:t xml:space="preserve"> = list ALL, including hidden items.</w:t>
+      </w:r>
+    </w:p>
+    <w:p>
+      <w:pPr>
+        <w:spacing w:after="120" w:before="0" w:lineRule="auto"/>
+        <w:rPr>
+          <w:color w:val="24292e"/>
+          <w:sz w:val="21"/>
+          <w:szCs w:val="21"/>
+        </w:rPr>
+      </w:pPr>
+      <w:r>
+        <w:rPr>
+          <w:color w:val="24292e"/>
+          <w:sz w:val="21"/>
+          <w:szCs w:val="21"/>
+          <w:rtl w:val="0"/>
+        </w:rPr>
+        <w:t xml:space="preserve">If you see a file called scroll, read it using </w:t>
+      </w:r>
+      <w:r>
+        <w:rPr>
+          <w:rFonts w:ascii="Courier New" w:cs="Courier New" w:eastAsia="Courier New" w:hAnsi="Courier New"/>
+          <w:color w:val="24292e"/>
+          <w:sz w:val="21"/>
+          <w:szCs w:val="21"/>
+          <w:rtl w:val="0"/>
+        </w:rPr>
+        <w:t xml:space="preserve">cat scroll</w:t>
+      </w:r>
+      <w:r>
+        <w:rPr>
+          <w:color w:val="24292e"/>
+          <w:sz w:val="21"/>
+          <w:szCs w:val="21"/>
+          <w:rtl w:val="0"/>
+        </w:rPr>
+        <w:t xml:space="preserve">. If a command does not work, read the message carefully and try another idea. Do not use </w:t>
+      </w:r>
+      <w:r>
+        <w:rPr>
+          <w:rFonts w:ascii="Courier New" w:cs="Courier New" w:eastAsia="Courier New" w:hAnsi="Courier New"/>
+          <w:color w:val="24292e"/>
+          <w:sz w:val="21"/>
+          <w:szCs w:val="21"/>
+          <w:rtl w:val="0"/>
+        </w:rPr>
+        <w:t xml:space="preserve">sudo</w:t>
+      </w:r>
+      <w:r>
+        <w:rPr>
+          <w:color w:val="24292e"/>
+          <w:sz w:val="21"/>
+          <w:szCs w:val="21"/>
+          <w:rtl w:val="0"/>
+        </w:rPr>
+        <w:t xml:space="preserve"> inside the game.</w:t>
+      </w:r>
+    </w:p>
+    <w:p>
+      <w:pPr>
+        <w:pStyle w:val="Heading2"/>
+        <w:keepNext w:val="1"/>
+        <w:spacing w:after="100" w:before="240" w:lineRule="auto"/>
+        <w:rPr/>
+      </w:pPr>
+      <w:bookmarkStart w:colFirst="0" w:colLast="0" w:name="_sapato8136ym" w:id="10"/>
+      <w:bookmarkEnd w:id="10"/>
       <w:r>
         <w:rPr>
           <w:rtl w:val="0"/>
@@ -2676,8 +2896,8 @@
         <w:spacing w:after="100" w:before="240" w:lineRule="auto"/>
         <w:rPr/>
       </w:pPr>
-      <w:bookmarkStart w:colFirst="0" w:colLast="0" w:name="_44e8i5hbwa3g" w:id="9"/>
-      <w:bookmarkEnd w:id="9"/>
+      <w:bookmarkStart w:colFirst="0" w:colLast="0" w:name="_44e8i5hbwa3g" w:id="11"/>
+      <w:bookmarkEnd w:id="11"/>
       <w:r>
         <w:rPr>
           <w:rtl w:val="0"/>
@@ -2878,8 +3098,8 @@
         <w:spacing w:after="100" w:before="240" w:lineRule="auto"/>
         <w:rPr/>
       </w:pPr>
-      <w:bookmarkStart w:colFirst="0" w:colLast="0" w:name="_btjoa1bnrh1m" w:id="10"/>
-      <w:bookmarkEnd w:id="10"/>
+      <w:bookmarkStart w:colFirst="0" w:colLast="0" w:name="_btjoa1bnrh1m" w:id="12"/>
+      <w:bookmarkEnd w:id="12"/>
       <w:r>
         <w:rPr>
           <w:rtl w:val="0"/>
@@ -2951,8 +3171,8 @@
         <w:spacing w:after="100" w:before="240" w:lineRule="auto"/>
         <w:rPr/>
       </w:pPr>
-      <w:bookmarkStart w:colFirst="0" w:colLast="0" w:name="_nw1ejgnq65hr" w:id="11"/>
-      <w:bookmarkEnd w:id="11"/>
+      <w:bookmarkStart w:colFirst="0" w:colLast="0" w:name="_nw1ejgnq65hr" w:id="13"/>
+      <w:bookmarkEnd w:id="13"/>
       <w:r>
         <w:rPr>
           <w:rtl w:val="0"/>
@@ -3010,7 +3230,7 @@
           <w:u w:val="single"/>
         </w:rPr>
       </w:pPr>
-      <w:hyperlink r:id="rId10">
+      <w:hyperlink r:id="rId13">
         <w:r>
           <w:rPr>
             <w:b w:val="1"/>
@@ -3042,7 +3262,7 @@
           <w:u w:val="single"/>
         </w:rPr>
       </w:pPr>
-      <w:hyperlink r:id="rId11">
+      <w:hyperlink r:id="rId14">
         <w:r>
           <w:rPr>
             <w:b w:val="1"/>
@@ -3079,7 +3299,7 @@
       </w:r>
     </w:p>
     <w:sectPr>
-      <w:footerReference r:id="rId12" w:type="default"/>
+      <w:footerReference r:id="rId15" w:type="default"/>
       <w:pgSz w:h="15840" w:w="12240" w:orient="portrait"/>
       <w:pgMar w:bottom="1440" w:top="1440" w:left="1440" w:right="1440" w:header="720" w:footer="720"/>
       <w:pgNumType w:start="1"/>

</xml_diff>